<commit_message>
feat(templates): decision 1 PSI numbers the responsibilities under contracts as an item of its own, and decision 2 PSI prints a staff category's interval only when the client has posts in it
</commit_message>
<xml_diff>
--- a/packages/document-engine/templates/fire/1.1_fire_decision_organization.docx
+++ b/packages/document-engine/templates/fire/1.1_fire_decision_organization.docx
@@ -2094,12 +2094,9 @@
         <w:pStyle w:val="HTMLPreformatted"/>
         <w:widowControl/>
         <w:numPr>
-          <w:ilvl w:val="1"/>
+          <w:ilvl w:val="0"/>
           <w:numId w:val="5"/>
         </w:numPr>
-        <w:tabs>
-          <w:tab w:val="clear" w:pos="916"/>
-        </w:tabs>
         <w:spacing w:before="0" w:after="40"/>
         <w:jc w:val="left"/>
         <w:rPr>

</xml_diff>

<commit_message>
fix(fire): decision 1 names the coordinator with the title "coordonator privind apărarea împotriva incendiilor", has the administrator approve the acts of authority, designates the workplace managers as "conducător al locului de muncă" or "conducători ai locurilor de muncă" by their count from fire.manyWorkplaceManagers, cites OMAI 163/2007 art. 149–150 for the own control, prints the technician "(după caz)" at point 16 too, writes "personalul aflat la program" in lower case, ends every list's last item with a stop, says "Prezenta decizie" without "internă" and leaves two empty rows in the acknowledgement table like the other decisions
</commit_message>
<xml_diff>
--- a/packages/document-engine/templates/fire/1.1_fire_decision_organization.docx
+++ b/packages/document-engine/templates/fire/1.1_fire_decision_organization.docx
@@ -298,7 +298,7 @@
           <w:szCs w:val="20"/>
           <w:lang w:val="ro-RO"/>
         </w:rPr>
-        <w:t>Pentru stabilirea structurilor cu atribuții în domeniul apărării împotriva incendiilor din cadrul {{cli</w:t>
+        <w:t xml:space="preserve">Pentru stabilirea structurilor cu atribuții în domeniul apărării împotriva incendiilor din cadrul {{cli</w:t>
       </w:r>
       <w:r>
         <w:rPr>
@@ -311,43 +311,43 @@
           <w:szCs w:val="20"/>
           <w:lang w:val="ro-RO"/>
         </w:rPr>
-        <w:t>ent.legalName}},</w:t>
-      </w:r>
-      <w:r>
-        <w:rPr>
-          <w:rFonts w:eastAsia="Arial" w:cs="Arial" w:ascii="Arial" w:hAnsi="Arial"/>
-          <w:color w:val="auto"/>
-          <w:spacing w:val="0"/>
-          <w:w w:val="100"/>
-          <w:sz w:val="20"/>
-          <w:szCs w:val="20"/>
-          <w:lang w:val="ro-RO"/>
-        </w:rPr>
-        <w:t xml:space="preserve"> conform OMAI 163/2007 – art. 6, se numește {{fire.coordinator.name}}, având funcția de {{fire.coordinato</w:t>
-      </w:r>
-      <w:r>
-        <w:rPr>
-          <w:rFonts w:eastAsia="Arial" w:cs="Arial" w:ascii="Arial" w:hAnsi="Arial"/>
-          <w:color w:val="auto"/>
-          <w:spacing w:val="0"/>
-          <w:w w:val="100"/>
-          <w:sz w:val="20"/>
-          <w:szCs w:val="20"/>
-          <w:lang w:val="ro-RO"/>
-        </w:rPr>
-        <w:t>r.jobTitleRunOn}</w:t>
-      </w:r>
-      <w:r>
-        <w:rPr>
-          <w:rFonts w:eastAsia="Arial" w:cs="Arial" w:ascii="Arial" w:hAnsi="Arial"/>
-          <w:color w:val="auto"/>
-          <w:spacing w:val="0"/>
-          <w:w w:val="100"/>
-          <w:sz w:val="20"/>
-          <w:szCs w:val="20"/>
-          <w:lang w:val="ro-RO"/>
-        </w:rPr>
-        <w:t>} în cadrul {{cl</w:t>
+        <w:t xml:space="preserve">ent.legalName}},</w:t>
+      </w:r>
+      <w:r>
+        <w:rPr>
+          <w:rFonts w:eastAsia="Arial" w:cs="Arial" w:ascii="Arial" w:hAnsi="Arial"/>
+          <w:color w:val="auto"/>
+          <w:spacing w:val="0"/>
+          <w:w w:val="100"/>
+          <w:sz w:val="20"/>
+          <w:szCs w:val="20"/>
+          <w:lang w:val="ro-RO"/>
+        </w:rPr>
+        <w:t xml:space="preserve"> conform OMAI 163/2007 – art. 6, se numește coordonator privind apărarea împotriva incendiilor {{fire.coordinator.name}}, având funcția de {{fire.coordinato</w:t>
+      </w:r>
+      <w:r>
+        <w:rPr>
+          <w:rFonts w:eastAsia="Arial" w:cs="Arial" w:ascii="Arial" w:hAnsi="Arial"/>
+          <w:color w:val="auto"/>
+          <w:spacing w:val="0"/>
+          <w:w w:val="100"/>
+          <w:sz w:val="20"/>
+          <w:szCs w:val="20"/>
+          <w:lang w:val="ro-RO"/>
+        </w:rPr>
+        <w:t xml:space="preserve">r.jobTitleRunOn}</w:t>
+      </w:r>
+      <w:r>
+        <w:rPr>
+          <w:rFonts w:eastAsia="Arial" w:cs="Arial" w:ascii="Arial" w:hAnsi="Arial"/>
+          <w:color w:val="auto"/>
+          <w:spacing w:val="0"/>
+          <w:w w:val="100"/>
+          <w:sz w:val="20"/>
+          <w:szCs w:val="20"/>
+          <w:lang w:val="ro-RO"/>
+        </w:rPr>
+        <w:t xml:space="preserve">} în cadrul {{cl</w:t>
       </w:r>
       <w:r>
         <w:rPr>
@@ -360,19 +360,19 @@
           <w:szCs w:val="20"/>
           <w:lang w:val="ro-RO"/>
         </w:rPr>
-        <w:t>ient.legalName}}</w:t>
-      </w:r>
-      <w:r>
-        <w:rPr>
-          <w:rFonts w:eastAsia="Arial" w:cs="Arial" w:ascii="Arial" w:hAnsi="Arial"/>
-          <w:color w:val="auto"/>
-          <w:spacing w:val="0"/>
-          <w:w w:val="100"/>
-          <w:sz w:val="20"/>
-          <w:szCs w:val="20"/>
-          <w:lang w:val="ro-RO"/>
-        </w:rPr>
-        <w:t>;</w:t>
+        <w:t xml:space="preserve">ient.legalName}}</w:t>
+      </w:r>
+      <w:r>
+        <w:rPr>
+          <w:rFonts w:eastAsia="Arial" w:cs="Arial" w:ascii="Arial" w:hAnsi="Arial"/>
+          <w:color w:val="auto"/>
+          <w:spacing w:val="0"/>
+          <w:w w:val="100"/>
+          <w:sz w:val="20"/>
+          <w:szCs w:val="20"/>
+          <w:lang w:val="ro-RO"/>
+        </w:rPr>
+        <w:t xml:space="preserve">;</w:t>
       </w:r>
     </w:p>
     <w:p>
@@ -534,7 +534,7 @@
           <w:szCs w:val="20"/>
           <w:lang w:val="ro-RO"/>
         </w:rPr>
-        <w:t>{{fireSafetyTechnician.name}}, cadru tehnic cu atribuții în domeniul apărării împotriva incendiilor, reprezentant al {{provider.legalName}} (după caz);</w:t>
+        <w:t xml:space="preserve">{{fireSafetyTechnician.name}}, cadru tehnic cu atribuții în domeniul apărării împotriva incendiilor, reprezentant al {{provider.legalName}} (după caz).</w:t>
       </w:r>
     </w:p>
     <w:p>
@@ -561,7 +561,7 @@
           <w:szCs w:val="20"/>
           <w:lang w:val="ro-RO"/>
         </w:rPr>
-        <w:t>Pentru aprobarea actelor de autoritate emise în cadrul {{cli</w:t>
+        <w:t xml:space="preserve">Pentru aprobarea actelor de autoritate emise în cadrul {{client.legalName}}, se numește {{client.representativeName}}, având funcția de {{fire.representativeRoleRunOn}}</w:t>
       </w:r>
       <w:r>
         <w:rPr>
@@ -574,43 +574,43 @@
           <w:szCs w:val="20"/>
           <w:lang w:val="ro-RO"/>
         </w:rPr>
-        <w:t>ent.legalName}},</w:t>
-      </w:r>
-      <w:r>
-        <w:rPr>
-          <w:rFonts w:eastAsia="Arial" w:cs="Arial" w:ascii="Arial" w:hAnsi="Arial"/>
-          <w:color w:val="auto"/>
-          <w:spacing w:val="0"/>
-          <w:w w:val="100"/>
-          <w:sz w:val="20"/>
-          <w:szCs w:val="20"/>
-          <w:lang w:val="ro-RO"/>
-        </w:rPr>
-        <w:t xml:space="preserve"> se numește {{fire.coordinator.name}}, având funcția de {{fir</w:t>
-      </w:r>
-      <w:r>
-        <w:rPr>
-          <w:rFonts w:eastAsia="Arial" w:cs="Arial" w:ascii="Arial" w:hAnsi="Arial"/>
-          <w:color w:val="auto"/>
-          <w:spacing w:val="0"/>
-          <w:w w:val="100"/>
-          <w:sz w:val="20"/>
-          <w:szCs w:val="20"/>
-          <w:lang w:val="ro-RO"/>
-        </w:rPr>
-        <w:t>e.coordinator.jo</w:t>
-      </w:r>
-      <w:r>
-        <w:rPr>
-          <w:rFonts w:eastAsia="Arial" w:cs="Arial" w:ascii="Arial" w:hAnsi="Arial"/>
-          <w:color w:val="auto"/>
-          <w:spacing w:val="0"/>
-          <w:w w:val="100"/>
-          <w:sz w:val="20"/>
-          <w:szCs w:val="20"/>
-          <w:lang w:val="ro-RO"/>
-        </w:rPr>
-        <w:t>bTitleRunOn}} în</w:t>
+        <w:t xml:space="preserve"/>
+      </w:r>
+      <w:r>
+        <w:rPr>
+          <w:rFonts w:eastAsia="Arial" w:cs="Arial" w:ascii="Arial" w:hAnsi="Arial"/>
+          <w:color w:val="auto"/>
+          <w:spacing w:val="0"/>
+          <w:w w:val="100"/>
+          <w:sz w:val="20"/>
+          <w:szCs w:val="20"/>
+          <w:lang w:val="ro-RO"/>
+        </w:rPr>
+        <w:t xml:space="preserve"/>
+      </w:r>
+      <w:r>
+        <w:rPr>
+          <w:rFonts w:eastAsia="Arial" w:cs="Arial" w:ascii="Arial" w:hAnsi="Arial"/>
+          <w:color w:val="auto"/>
+          <w:spacing w:val="0"/>
+          <w:w w:val="100"/>
+          <w:sz w:val="20"/>
+          <w:szCs w:val="20"/>
+          <w:lang w:val="ro-RO"/>
+        </w:rPr>
+        <w:t xml:space="preserve"/>
+      </w:r>
+      <w:r>
+        <w:rPr>
+          <w:rFonts w:eastAsia="Arial" w:cs="Arial" w:ascii="Arial" w:hAnsi="Arial"/>
+          <w:color w:val="auto"/>
+          <w:spacing w:val="0"/>
+          <w:w w:val="100"/>
+          <w:sz w:val="20"/>
+          <w:szCs w:val="20"/>
+          <w:lang w:val="ro-RO"/>
+        </w:rPr>
+        <w:t xml:space="preserve"> în</w:t>
       </w:r>
       <w:r>
         <w:rPr>
@@ -635,7 +635,7 @@
           <w:szCs w:val="20"/>
           <w:lang w:val="ro-RO"/>
         </w:rPr>
-        <w:t>.legalName}};</w:t>
+        <w:t xml:space="preserve">.legalName}};</w:t>
       </w:r>
     </w:p>
     <w:p>
@@ -763,7 +763,7 @@
           <w:szCs w:val="20"/>
           <w:lang w:val="ro-RO"/>
         </w:rPr>
-        <w:t>Pentru organizarea apărării împotriva incendiilor la locurile de muncă din cadrul {{cl</w:t>
+        <w:t xml:space="preserve">Pentru organizarea apărării împotriva incendiilor la locurile de muncă din cadrul {{cl</w:t>
       </w:r>
       <w:r>
         <w:rPr>
@@ -776,43 +776,43 @@
           <w:szCs w:val="20"/>
           <w:lang w:val="ro-RO"/>
         </w:rPr>
-        <w:t>ient.legalName}}</w:t>
-      </w:r>
-      <w:r>
-        <w:rPr>
-          <w:rFonts w:eastAsia="Arial" w:cs="Arial" w:ascii="Arial" w:hAnsi="Arial"/>
-          <w:color w:val="auto"/>
-          <w:spacing w:val="0"/>
-          <w:w w:val="100"/>
-          <w:sz w:val="20"/>
-          <w:szCs w:val="20"/>
-          <w:lang w:val="ro-RO"/>
-        </w:rPr>
-        <w:t>, conform OMAI 163/2007 – art. 23, se desemnează ca șef al locului de muncă: {{#fire.workplaceManagers}}{{name}</w:t>
-      </w:r>
-      <w:r>
-        <w:rPr>
-          <w:rFonts w:eastAsia="Arial" w:cs="Arial" w:ascii="Arial" w:hAnsi="Arial"/>
-          <w:color w:val="auto"/>
-          <w:spacing w:val="0"/>
-          <w:w w:val="100"/>
-          <w:sz w:val="20"/>
-          <w:szCs w:val="20"/>
-          <w:lang w:val="ro-RO"/>
-        </w:rPr>
-        <w:t>}, având funcți</w:t>
-      </w:r>
-      <w:r>
-        <w:rPr>
-          <w:rFonts w:eastAsia="Arial" w:cs="Arial" w:ascii="Arial" w:hAnsi="Arial"/>
-          <w:color w:val="auto"/>
-          <w:spacing w:val="0"/>
-          <w:w w:val="100"/>
-          <w:sz w:val="20"/>
-          <w:szCs w:val="20"/>
-          <w:lang w:val="ro-RO"/>
-        </w:rPr>
-        <w:t>a de {{jobTitleR</w:t>
+        <w:t xml:space="preserve">ient.legalName}}</w:t>
+      </w:r>
+      <w:r>
+        <w:rPr>
+          <w:rFonts w:eastAsia="Arial" w:cs="Arial" w:ascii="Arial" w:hAnsi="Arial"/>
+          <w:color w:val="auto"/>
+          <w:spacing w:val="0"/>
+          <w:w w:val="100"/>
+          <w:sz w:val="20"/>
+          <w:szCs w:val="20"/>
+          <w:lang w:val="ro-RO"/>
+        </w:rPr>
+        <w:t xml:space="preserve">, conform OMAI 163/2007 – art. 23, se desemnează ca {{#fire.manyWorkplaceManagers}}conducători ai locurilor de muncă{{/fire.manyWorkplaceManagers}}{{^fire.manyWorkplaceManagers}}conducător al locului de muncă{{/fire.manyWorkplaceManagers}}: {{#fire.workplaceManagers}}{{name}</w:t>
+      </w:r>
+      <w:r>
+        <w:rPr>
+          <w:rFonts w:eastAsia="Arial" w:cs="Arial" w:ascii="Arial" w:hAnsi="Arial"/>
+          <w:color w:val="auto"/>
+          <w:spacing w:val="0"/>
+          <w:w w:val="100"/>
+          <w:sz w:val="20"/>
+          <w:szCs w:val="20"/>
+          <w:lang w:val="ro-RO"/>
+        </w:rPr>
+        <w:t xml:space="preserve">}, având funcți</w:t>
+      </w:r>
+      <w:r>
+        <w:rPr>
+          <w:rFonts w:eastAsia="Arial" w:cs="Arial" w:ascii="Arial" w:hAnsi="Arial"/>
+          <w:color w:val="auto"/>
+          <w:spacing w:val="0"/>
+          <w:w w:val="100"/>
+          <w:sz w:val="20"/>
+          <w:szCs w:val="20"/>
+          <w:lang w:val="ro-RO"/>
+        </w:rPr>
+        <w:t xml:space="preserve">a de {{jobTitleR</w:t>
       </w:r>
       <w:r>
         <w:rPr>
@@ -825,19 +825,19 @@
           <w:szCs w:val="20"/>
           <w:lang w:val="ro-RO"/>
         </w:rPr>
-        <w:t>unOn}}, pentru {</w:t>
-      </w:r>
-      <w:r>
-        <w:rPr>
-          <w:rFonts w:eastAsia="Arial" w:cs="Arial" w:ascii="Arial" w:hAnsi="Arial"/>
-          <w:color w:val="auto"/>
-          <w:spacing w:val="0"/>
-          <w:w w:val="100"/>
-          <w:sz w:val="20"/>
-          <w:szCs w:val="20"/>
-          <w:lang w:val="ro-RO"/>
-        </w:rPr>
-        <w:t>{#workplaceName}}{{workplaceName}}{{/workplaceName}}{{^workplaceName}}fiecare loc de muncă{{/workplaceName}}; {{/fire.workplaceManagers}}</w:t>
+        <w:t xml:space="preserve">unOn}}, pentru {</w:t>
+      </w:r>
+      <w:r>
+        <w:rPr>
+          <w:rFonts w:eastAsia="Arial" w:cs="Arial" w:ascii="Arial" w:hAnsi="Arial"/>
+          <w:color w:val="auto"/>
+          <w:spacing w:val="0"/>
+          <w:w w:val="100"/>
+          <w:sz w:val="20"/>
+          <w:szCs w:val="20"/>
+          <w:lang w:val="ro-RO"/>
+        </w:rPr>
+        <w:t xml:space="preserve">{#workplaceName}}{{workplaceName}}{{/workplaceName}}{{^workplaceName}}fiecare loc de muncă{{/workplaceName}}; {{/fire.workplaceManagers}}</w:t>
       </w:r>
     </w:p>
     <w:p>
@@ -865,7 +865,7 @@
           <w:szCs w:val="20"/>
           <w:lang w:val="ro-RO"/>
         </w:rPr>
-        <w:t>Pentru planificarea și executarea controalelor proprii din cadrul {{c</w:t>
+        <w:t xml:space="preserve">Pentru planificarea și executarea controalelor proprii din cadrul {{c</w:t>
       </w:r>
       <w:r>
         <w:rPr>
@@ -878,19 +878,19 @@
           <w:szCs w:val="20"/>
           <w:lang w:val="ro-RO"/>
         </w:rPr>
-        <w:t>lient.legalName}</w:t>
-      </w:r>
-      <w:r>
-        <w:rPr>
-          <w:rFonts w:eastAsia="Arial" w:cs="Arial" w:ascii="Arial" w:hAnsi="Arial"/>
-          <w:color w:val="auto"/>
-          <w:spacing w:val="0"/>
-          <w:w w:val="100"/>
-          <w:sz w:val="20"/>
-          <w:szCs w:val="20"/>
-          <w:lang w:val="ro-RO"/>
-        </w:rPr>
-        <w:t>}, conform OMAI 163/2007 – art. 149–151, se desemnează:</w:t>
+        <w:t xml:space="preserve">lient.legalName}</w:t>
+      </w:r>
+      <w:r>
+        <w:rPr>
+          <w:rFonts w:eastAsia="Arial" w:cs="Arial" w:ascii="Arial" w:hAnsi="Arial"/>
+          <w:color w:val="auto"/>
+          <w:spacing w:val="0"/>
+          <w:w w:val="100"/>
+          <w:sz w:val="20"/>
+          <w:szCs w:val="20"/>
+          <w:lang w:val="ro-RO"/>
+        </w:rPr>
+        <w:t xml:space="preserve">}, conform OMAI 163/2007 – art. 149–150, se desemnează:</w:t>
       </w:r>
     </w:p>
     <w:p>
@@ -999,7 +999,7 @@
           <w:szCs w:val="20"/>
           <w:lang w:val="ro-RO"/>
         </w:rPr>
-        <w:t>{{fireSafetyTechnician.name}}, cadru tehnic cu atribuții în domeniul apărării împotriva incendiilor, reprezentant al {{provider.legalName}} (după caz);</w:t>
+        <w:t xml:space="preserve">{{fireSafetyTechnician.name}}, cadru tehnic cu atribuții în domeniul apărării împotriva incendiilor, reprezentant al {{provider.legalName}} (după caz).</w:t>
       </w:r>
     </w:p>
     <w:p>
@@ -1161,7 +1161,7 @@
           <w:szCs w:val="20"/>
           <w:lang w:val="ro-RO"/>
         </w:rPr>
-        <w:t>{{fireSafetyTechnician.name}}, cadru tehnic cu atribuții în domeniul apărării împotriva incendiilor, reprezentant al {{provider.legalName}} (după caz);</w:t>
+        <w:t xml:space="preserve">{{fireSafetyTechnician.name}}, cadru tehnic cu atribuții în domeniul apărării împotriva incendiilor, reprezentant al {{provider.legalName}} (după caz).</w:t>
       </w:r>
     </w:p>
     <w:p>
@@ -1348,7 +1348,7 @@
           <w:szCs w:val="20"/>
           <w:lang w:val="ro-RO"/>
         </w:rPr>
-        <w:t>{{fireSafetyTechnician.name}}, cadru tehnic cu atribuții în domeniul apărării împotriva incendiilor, reprezentant al {{provider.legalName}} (după caz);</w:t>
+        <w:t xml:space="preserve">{{fireSafetyTechnician.name}}, cadru tehnic cu atribuții în domeniul apărării împotriva incendiilor, reprezentant al {{provider.legalName}} (după caz).</w:t>
       </w:r>
     </w:p>
     <w:p>
@@ -1510,7 +1510,7 @@
           <w:szCs w:val="20"/>
           <w:lang w:val="ro-RO"/>
         </w:rPr>
-        <w:t>{{fireSafetyTechnician.name}}, cadru tehnic cu atribuții în domeniul apărării împotriva incendiilor, reprezentant al {{provider.legalName}} (după caz);</w:t>
+        <w:t xml:space="preserve">{{fireSafetyTechnician.name}}, cadru tehnic cu atribuții în domeniul apărării împotriva incendiilor, reprezentant al {{provider.legalName}} (după caz).</w:t>
       </w:r>
     </w:p>
     <w:p>
@@ -1672,7 +1672,7 @@
           <w:szCs w:val="20"/>
           <w:lang w:val="ro-RO"/>
         </w:rPr>
-        <w:t>{{fireSafetyTechnician.name}}, cadru tehnic cu atribuții în domeniul apărării împotriva incendiilor, reprezentant al {{provider.legalName}} (după caz);</w:t>
+        <w:t xml:space="preserve">{{fireSafetyTechnician.name}}, cadru tehnic cu atribuții în domeniul apărării împotriva incendiilor, reprezentant al {{provider.legalName}} (după caz).</w:t>
       </w:r>
     </w:p>
     <w:p>
@@ -1755,7 +1755,7 @@
           <w:szCs w:val="20"/>
           <w:lang w:val="ro-RO"/>
         </w:rPr>
-        <w:t>{{fire.coordinator.name}},</w:t>
+        <w:t xml:space="preserve">{{fire.coordinator.name}},</w:t>
       </w:r>
       <w:r>
         <w:rPr>
@@ -1779,7 +1779,7 @@
           <w:szCs w:val="20"/>
           <w:lang w:val="ro-RO"/>
         </w:rPr>
-        <w:t>e {{fire.coordin</w:t>
+        <w:t xml:space="preserve">e {{fire.coordin</w:t>
       </w:r>
       <w:r>
         <w:rPr>
@@ -1792,19 +1792,19 @@
           <w:szCs w:val="20"/>
           <w:lang w:val="ro-RO"/>
         </w:rPr>
-        <w:t>ator.jobTitleRun</w:t>
-      </w:r>
-      <w:r>
-        <w:rPr>
-          <w:rFonts w:eastAsia="Arial" w:cs="Arial" w:ascii="Arial" w:hAnsi="Arial"/>
-          <w:color w:val="auto"/>
-          <w:spacing w:val="0"/>
-          <w:w w:val="100"/>
-          <w:sz w:val="20"/>
-          <w:szCs w:val="20"/>
-          <w:lang w:val="ro-RO"/>
-        </w:rPr>
-        <w:t>On}} în cadrul {{client.legalName}};</w:t>
+        <w:t xml:space="preserve">ator.jobTitleRun</w:t>
+      </w:r>
+      <w:r>
+        <w:rPr>
+          <w:rFonts w:eastAsia="Arial" w:cs="Arial" w:ascii="Arial" w:hAnsi="Arial"/>
+          <w:color w:val="auto"/>
+          <w:spacing w:val="0"/>
+          <w:w w:val="100"/>
+          <w:sz w:val="20"/>
+          <w:szCs w:val="20"/>
+          <w:lang w:val="ro-RO"/>
+        </w:rPr>
+        <w:t xml:space="preserve">On}} în cadrul {{client.legalName}}.</w:t>
       </w:r>
     </w:p>
     <w:p>
@@ -1887,7 +1887,7 @@
           <w:szCs w:val="20"/>
           <w:lang w:val="ro-RO"/>
         </w:rPr>
-        <w:t>{{fire.coordinator.name}},</w:t>
+        <w:t xml:space="preserve">{{fire.coordinator.name}},</w:t>
       </w:r>
       <w:r>
         <w:rPr>
@@ -1911,7 +1911,7 @@
           <w:szCs w:val="20"/>
           <w:lang w:val="ro-RO"/>
         </w:rPr>
-        <w:t>e {{fire.coordin</w:t>
+        <w:t xml:space="preserve">e {{fire.coordin</w:t>
       </w:r>
       <w:r>
         <w:rPr>
@@ -1924,19 +1924,19 @@
           <w:szCs w:val="20"/>
           <w:lang w:val="ro-RO"/>
         </w:rPr>
-        <w:t>ator.jobTitleRun</w:t>
-      </w:r>
-      <w:r>
-        <w:rPr>
-          <w:rFonts w:eastAsia="Arial" w:cs="Arial" w:ascii="Arial" w:hAnsi="Arial"/>
-          <w:color w:val="auto"/>
-          <w:spacing w:val="0"/>
-          <w:w w:val="100"/>
-          <w:sz w:val="20"/>
-          <w:szCs w:val="20"/>
-          <w:lang w:val="ro-RO"/>
-        </w:rPr>
-        <w:t>On}} în cadrul {{client.legalName}};</w:t>
+        <w:t xml:space="preserve">ator.jobTitleRun</w:t>
+      </w:r>
+      <w:r>
+        <w:rPr>
+          <w:rFonts w:eastAsia="Arial" w:cs="Arial" w:ascii="Arial" w:hAnsi="Arial"/>
+          <w:color w:val="auto"/>
+          <w:spacing w:val="0"/>
+          <w:w w:val="100"/>
+          <w:sz w:val="20"/>
+          <w:szCs w:val="20"/>
+          <w:lang w:val="ro-RO"/>
+        </w:rPr>
+        <w:t xml:space="preserve">On}} în cadrul {{client.legalName}}.</w:t>
       </w:r>
     </w:p>
     <w:p>
@@ -2098,7 +2098,7 @@
           <w:szCs w:val="20"/>
           <w:lang w:val="ro-RO"/>
         </w:rPr>
-        <w:t>{{fireSafetyTechnician.name}}, cadru tehnic cu atribuții în domeniul apărării împotriva incendiilor, reprezentant al {{provider.legalName}} (după caz);</w:t>
+        <w:t xml:space="preserve">{{fireSafetyTechnician.name}}, cadru tehnic cu atribuții în domeniul apărării împotriva incendiilor, reprezentant al {{provider.legalName}} (după caz).</w:t>
       </w:r>
     </w:p>
     <w:p>
@@ -2361,7 +2361,7 @@
           <w:szCs w:val="20"/>
           <w:lang w:val="ro-RO"/>
         </w:rPr>
-        <w:t>{{fireSafetyTechnician.name}}, cadru tehnic cu atribuții în domeniul apărării împotriva incendiilor, reprezentant al {{provider.legalName}} (după caz);</w:t>
+        <w:t xml:space="preserve">{{fireSafetyTechnician.name}}, cadru tehnic cu atribuții în domeniul apărării împotriva incendiilor, reprezentant al {{provider.legalName}} (după caz).</w:t>
       </w:r>
     </w:p>
     <w:p>
@@ -2523,7 +2523,7 @@
           <w:szCs w:val="20"/>
           <w:lang w:val="ro-RO"/>
         </w:rPr>
-        <w:t>{{fireSafetyTechnician.name}}, cadru tehnic cu atribuții în domeniul apărării împotriva incendiilor, reprezentant al {{provider.legalName}};</w:t>
+        <w:t xml:space="preserve">{{fireSafetyTechnician.name}}, cadru tehnic cu atribuții în domeniul apărării împotriva incendiilor, reprezentant al {{provider.legalName}} (după caz).</w:t>
       </w:r>
     </w:p>
     <w:p>
@@ -2685,7 +2685,7 @@
           <w:szCs w:val="20"/>
           <w:lang w:val="ro-RO"/>
         </w:rPr>
-        <w:t>Personalul aflat la program – acționează cu stingătoarele;</w:t>
+        <w:t xml:space="preserve">personalul aflat la program – acționează cu stingătoarele;</w:t>
       </w:r>
     </w:p>
     <w:p>
@@ -2715,7 +2715,7 @@
           <w:szCs w:val="20"/>
           <w:lang w:val="ro-RO"/>
         </w:rPr>
-        <w:t>Personalul aflat la program – evacuează persoanele;</w:t>
+        <w:t xml:space="preserve">personalul aflat la program – evacuează persoanele;</w:t>
       </w:r>
     </w:p>
     <w:p>
@@ -2745,7 +2745,7 @@
           <w:szCs w:val="20"/>
           <w:lang w:val="ro-RO"/>
         </w:rPr>
-        <w:t>Personalul aflat la program – evacuează bunurile materiale;</w:t>
+        <w:t xml:space="preserve">personalul aflat la program – evacuează bunurile materiale;</w:t>
       </w:r>
     </w:p>
     <w:p>
@@ -2887,7 +2887,7 @@
           <w:szCs w:val="20"/>
           <w:lang w:val="ro-RO"/>
         </w:rPr>
-        <w:t>Prezenta decizie internă a {{cli</w:t>
+        <w:t xml:space="preserve">Prezenta decizie a {{cli</w:t>
       </w:r>
       <w:r>
         <w:rPr>
@@ -2912,7 +2912,7 @@
           <w:szCs w:val="20"/>
           <w:lang w:val="ro-RO"/>
         </w:rPr>
-        <w:t>se aduce la cunoștința persoanelor nominalizate în aceasta.</w:t>
+        <w:t xml:space="preserve">se aduce la cunoștința persoanelor nominalizate în aceasta.</w:t>
       </w:r>
     </w:p>
     <w:p>
@@ -3619,6 +3619,201 @@
           <w:p>
             <w:pPr>
               <w:pStyle w:val="Normal"/>
+              <w:keepNext w:val="true"/>
+              <w:widowControl/>
+              <w:numPr>
+                <w:ilvl w:val="0"/>
+                <w:numId w:val="4"/>
+              </w:numPr>
+              <w:snapToGrid w:val="false"/>
+              <w:spacing w:before="0" w:after="0"/>
+              <w:ind w:hanging="360" w:left="360" w:right="-108"/>
+              <w:jc w:val="center"/>
+              <w:rPr>
+                <w:rFonts w:ascii="Arial" w:hAnsi="Arial" w:cs="Arial"/>
+                <w:b/>
+                <w:sz w:val="20"/>
+                <w:szCs w:val="20"/>
+              </w:rPr>
+            </w:pPr>
+            <w:r>
+              <w:rPr>
+                <w:rFonts w:eastAsia="Arial" w:cs="Arial" w:ascii="Arial" w:hAnsi="Arial"/>
+                <w:b/>
+                <w:color w:val="auto"/>
+                <w:spacing w:val="0"/>
+                <w:w w:val="100"/>
+                <w:sz w:val="20"/>
+                <w:szCs w:val="20"/>
+                <w:lang w:val="ro-RO"/>
+              </w:rPr>
+            </w:r>
+          </w:p>
+        </w:tc>
+        <w:tc>
+          <w:tcPr>
+            <w:tcW w:w="3458" w:type="dxa"/>
+            <w:tcBorders>
+              <w:top w:val="single" w:sz="4" w:space="0" w:color="000000"/>
+              <w:left w:val="single" w:sz="4" w:space="0" w:color="000000"/>
+              <w:bottom w:val="single" w:sz="4" w:space="0" w:color="000000"/>
+              <w:right w:val="single" w:sz="4" w:space="0" w:color="000000"/>
+            </w:tcBorders>
+            <w:vAlign w:val="center"/>
+          </w:tcPr>
+          <w:p>
+            <w:pPr>
+              <w:pStyle w:val="Normal"/>
+              <w:widowControl/>
+              <w:snapToGrid w:val="false"/>
+              <w:spacing w:before="0" w:after="0"/>
+              <w:rPr>
+                <w:rFonts w:ascii="Arial" w:hAnsi="Arial" w:cs="Arial"/>
+                <w:sz w:val="20"/>
+                <w:szCs w:val="20"/>
+              </w:rPr>
+            </w:pPr>
+            <w:r>
+              <w:rPr>
+                <w:rFonts w:eastAsia="Arial" w:cs="Arial" w:ascii="Arial" w:hAnsi="Arial"/>
+                <w:color w:val="auto"/>
+                <w:spacing w:val="0"/>
+                <w:w w:val="100"/>
+                <w:sz w:val="20"/>
+                <w:szCs w:val="20"/>
+                <w:lang w:val="ro-RO"/>
+              </w:rPr>
+            </w:r>
+          </w:p>
+        </w:tc>
+        <w:tc>
+          <w:tcPr>
+            <w:tcW w:w="2076" w:type="dxa"/>
+            <w:tcBorders>
+              <w:top w:val="single" w:sz="4" w:space="0" w:color="000000"/>
+              <w:left w:val="single" w:sz="4" w:space="0" w:color="000000"/>
+              <w:bottom w:val="single" w:sz="4" w:space="0" w:color="000000"/>
+              <w:right w:val="single" w:sz="4" w:space="0" w:color="000000"/>
+            </w:tcBorders>
+            <w:vAlign w:val="center"/>
+          </w:tcPr>
+          <w:p>
+            <w:pPr>
+              <w:pStyle w:val="Normal"/>
+              <w:widowControl/>
+              <w:snapToGrid w:val="false"/>
+              <w:spacing w:before="0" w:after="0"/>
+              <w:jc w:val="center"/>
+              <w:rPr>
+                <w:rFonts w:ascii="Arial" w:hAnsi="Arial" w:cs="Arial"/>
+                <w:sz w:val="20"/>
+                <w:szCs w:val="20"/>
+              </w:rPr>
+            </w:pPr>
+            <w:r>
+              <w:rPr>
+                <w:rFonts w:eastAsia="Arial" w:cs="Arial" w:ascii="Arial" w:hAnsi="Arial"/>
+                <w:color w:val="auto"/>
+                <w:spacing w:val="0"/>
+                <w:w w:val="100"/>
+                <w:sz w:val="20"/>
+                <w:szCs w:val="20"/>
+                <w:lang w:val="ro-RO"/>
+              </w:rPr>
+            </w:r>
+          </w:p>
+        </w:tc>
+        <w:tc>
+          <w:tcPr>
+            <w:tcW w:w="1297" w:type="dxa"/>
+            <w:tcBorders>
+              <w:top w:val="single" w:sz="4" w:space="0" w:color="000000"/>
+              <w:left w:val="single" w:sz="4" w:space="0" w:color="000000"/>
+              <w:bottom w:val="single" w:sz="4" w:space="0" w:color="000000"/>
+              <w:right w:val="single" w:sz="4" w:space="0" w:color="000000"/>
+            </w:tcBorders>
+            <w:vAlign w:val="center"/>
+          </w:tcPr>
+          <w:p>
+            <w:pPr>
+              <w:pStyle w:val="Normal"/>
+              <w:widowControl/>
+              <w:snapToGrid w:val="false"/>
+              <w:spacing w:before="0" w:after="0"/>
+              <w:jc w:val="center"/>
+              <w:rPr>
+                <w:rFonts w:ascii="Arial" w:hAnsi="Arial" w:cs="Arial"/>
+                <w:sz w:val="20"/>
+                <w:szCs w:val="20"/>
+              </w:rPr>
+            </w:pPr>
+            <w:r>
+              <w:rPr>
+                <w:rFonts w:eastAsia="Arial" w:cs="Arial" w:ascii="Arial" w:hAnsi="Arial"/>
+                <w:color w:val="auto"/>
+                <w:spacing w:val="0"/>
+                <w:w w:val="100"/>
+                <w:sz w:val="20"/>
+                <w:szCs w:val="20"/>
+                <w:lang w:val="ro-RO"/>
+              </w:rPr>
+            </w:r>
+          </w:p>
+        </w:tc>
+        <w:tc>
+          <w:tcPr>
+            <w:tcW w:w="1903" w:type="dxa"/>
+            <w:tcBorders>
+              <w:top w:val="single" w:sz="4" w:space="0" w:color="000000"/>
+              <w:left w:val="single" w:sz="4" w:space="0" w:color="000000"/>
+              <w:bottom w:val="single" w:sz="4" w:space="0" w:color="000000"/>
+              <w:right w:val="single" w:sz="4" w:space="0" w:color="000000"/>
+            </w:tcBorders>
+          </w:tcPr>
+          <w:p>
+            <w:pPr>
+              <w:pStyle w:val="Normal"/>
+              <w:widowControl/>
+              <w:snapToGrid w:val="false"/>
+              <w:spacing w:before="0" w:after="0"/>
+              <w:rPr>
+                <w:rFonts w:ascii="Arial" w:hAnsi="Arial" w:cs="Arial"/>
+                <w:sz w:val="20"/>
+                <w:szCs w:val="20"/>
+              </w:rPr>
+            </w:pPr>
+            <w:r>
+              <w:rPr>
+                <w:rFonts w:eastAsia="Arial" w:cs="Arial" w:ascii="Arial" w:hAnsi="Arial"/>
+                <w:color w:val="auto"/>
+                <w:spacing w:val="0"/>
+                <w:w w:val="100"/>
+                <w:sz w:val="20"/>
+                <w:szCs w:val="20"/>
+                <w:lang w:val="ro-RO"/>
+              </w:rPr>
+            </w:r>
+          </w:p>
+        </w:tc>
+      </w:tr>
+      <w:tr>
+        <w:trPr>
+          <w:trHeight w:val="290" w:hRule="atLeast"/>
+        </w:trPr>
+        <w:tc>
+          <w:tcPr>
+            <w:tcW w:w="621" w:type="dxa"/>
+            <w:tcBorders>
+              <w:top w:val="single" w:sz="4" w:space="0" w:color="000000"/>
+              <w:left w:val="single" w:sz="4" w:space="0" w:color="000000"/>
+              <w:bottom w:val="single" w:sz="4" w:space="0" w:color="000000"/>
+              <w:right w:val="single" w:sz="4" w:space="0" w:color="000000"/>
+            </w:tcBorders>
+            <w:vAlign w:val="center"/>
+          </w:tcPr>
+          <w:p>
+            <w:pPr>
+              <w:pStyle w:val="Normal"/>
               <w:widowControl/>
               <w:numPr>
                 <w:ilvl w:val="0"/>

</xml_diff>